<commit_message>
Aktualizace Lean Canvas (v1.1) v docx a pridani lean-canvas.md
</commit_message>
<xml_diff>
--- a/docs/vystupy/lean-canvas.docx
+++ b/docs/vystupy/lean-canvas.docx
@@ -378,16 +378,19 @@
           </w:tcPr>
           <w:p>
             <w:pPr>
+              <w:spacing w:before="0" w:after="0"/>
               <w:ind w:right="-944"/>
               <w:rPr>
                 <w:rFonts w:ascii="Arial" w:hAnsi="Arial"/>
               </w:rPr>
             </w:pPr>
-            <w:r>
-              <w:rPr>
-                <w:rFonts w:ascii="Arial" w:hAnsi="Arial"/>
-              </w:rPr>
-              <w:t>1.0.</w:t>
+            <w:r/>
+            <w:r>
+              <w:rPr>
+                <w:rFonts w:ascii="Arial" w:hAnsi="Arial"/>
+                <w:sz w:val="20"/>
+              </w:rPr>
+              <w:t>1.1</w:t>
             </w:r>
           </w:p>
         </w:tc>
@@ -657,170 +660,66 @@
           </w:tcPr>
           <w:p>
             <w:pPr>
+              <w:spacing w:before="0" w:after="40" w:line="252" w:lineRule="auto"/>
               <w:rPr>
                 <w:rFonts w:ascii="Arial" w:hAnsi="Arial"/>
                 <w:color w:val="808080" w:themeColor="background1" w:themeShade="80"/>
                 <w:sz w:val="20"/>
               </w:rPr>
             </w:pPr>
-            <w:proofErr w:type="spellStart"/>
-            <w:r>
-              <w:rPr>
-                <w:rFonts w:ascii="Arial" w:hAnsi="Arial"/>
-                <w:color w:val="808080" w:themeColor="background1" w:themeShade="80"/>
-                <w:sz w:val="20"/>
-              </w:rPr>
-              <w:t>Obtížná</w:t>
-            </w:r>
-            <w:proofErr w:type="spellEnd"/>
-            <w:r>
-              <w:rPr>
-                <w:rFonts w:ascii="Arial" w:hAnsi="Arial"/>
-                <w:color w:val="808080" w:themeColor="background1" w:themeShade="80"/>
-                <w:sz w:val="20"/>
-              </w:rPr>
-              <w:t xml:space="preserve"> </w:t>
-            </w:r>
-            <w:proofErr w:type="spellStart"/>
-            <w:r>
-              <w:rPr>
-                <w:rFonts w:ascii="Arial" w:hAnsi="Arial"/>
-                <w:color w:val="808080" w:themeColor="background1" w:themeShade="80"/>
-                <w:sz w:val="20"/>
-              </w:rPr>
-              <w:t>organizace</w:t>
-            </w:r>
-            <w:proofErr w:type="spellEnd"/>
-            <w:r>
-              <w:rPr>
-                <w:rFonts w:ascii="Arial" w:hAnsi="Arial"/>
-                <w:color w:val="808080" w:themeColor="background1" w:themeShade="80"/>
-                <w:sz w:val="20"/>
-              </w:rPr>
-              <w:t xml:space="preserve"> </w:t>
-            </w:r>
-            <w:proofErr w:type="spellStart"/>
-            <w:r>
-              <w:rPr>
-                <w:rFonts w:ascii="Arial" w:hAnsi="Arial"/>
-                <w:color w:val="808080" w:themeColor="background1" w:themeShade="80"/>
-                <w:sz w:val="20"/>
-              </w:rPr>
-              <w:t>cviků</w:t>
-            </w:r>
-            <w:proofErr w:type="spellEnd"/>
-            <w:r>
-              <w:rPr>
-                <w:rFonts w:ascii="Arial" w:hAnsi="Arial"/>
-                <w:color w:val="808080" w:themeColor="background1" w:themeShade="80"/>
-                <w:sz w:val="20"/>
-              </w:rPr>
-              <w:t xml:space="preserve"> v </w:t>
-            </w:r>
-            <w:proofErr w:type="spellStart"/>
-            <w:r>
-              <w:rPr>
-                <w:rFonts w:ascii="Arial" w:hAnsi="Arial"/>
-                <w:color w:val="808080" w:themeColor="background1" w:themeShade="80"/>
-                <w:sz w:val="20"/>
-              </w:rPr>
-              <w:t>tréninku</w:t>
-            </w:r>
-            <w:proofErr w:type="spellEnd"/>
-          </w:p>
-          <w:p>
-            <w:pPr>
-              <w:rPr>
-                <w:rFonts w:ascii="Arial" w:hAnsi="Arial"/>
-                <w:color w:val="808080" w:themeColor="background1" w:themeShade="80"/>
-                <w:sz w:val="20"/>
-              </w:rPr>
-            </w:pPr>
-            <w:proofErr w:type="spellStart"/>
-            <w:r>
-              <w:rPr>
-                <w:rFonts w:ascii="Arial" w:hAnsi="Arial"/>
-                <w:color w:val="808080" w:themeColor="background1" w:themeShade="80"/>
-                <w:sz w:val="20"/>
-              </w:rPr>
-              <w:t>Těžké</w:t>
-            </w:r>
-            <w:proofErr w:type="spellEnd"/>
-            <w:r>
-              <w:rPr>
-                <w:rFonts w:ascii="Arial" w:hAnsi="Arial"/>
-                <w:color w:val="808080" w:themeColor="background1" w:themeShade="80"/>
-                <w:sz w:val="20"/>
-              </w:rPr>
-              <w:t xml:space="preserve"> </w:t>
-            </w:r>
-            <w:proofErr w:type="spellStart"/>
-            <w:r>
-              <w:rPr>
-                <w:rFonts w:ascii="Arial" w:hAnsi="Arial"/>
-                <w:color w:val="808080" w:themeColor="background1" w:themeShade="80"/>
-                <w:sz w:val="20"/>
-              </w:rPr>
-              <w:t>srovnávání</w:t>
-            </w:r>
-            <w:proofErr w:type="spellEnd"/>
-            <w:r>
-              <w:rPr>
-                <w:rFonts w:ascii="Arial" w:hAnsi="Arial"/>
-                <w:color w:val="808080" w:themeColor="background1" w:themeShade="80"/>
-                <w:sz w:val="20"/>
-              </w:rPr>
-              <w:t xml:space="preserve"> </w:t>
-            </w:r>
-            <w:proofErr w:type="spellStart"/>
-            <w:r>
-              <w:rPr>
-                <w:rFonts w:ascii="Arial" w:hAnsi="Arial"/>
-                <w:color w:val="808080" w:themeColor="background1" w:themeShade="80"/>
-                <w:sz w:val="20"/>
-              </w:rPr>
-              <w:t>efektivity</w:t>
-            </w:r>
-            <w:proofErr w:type="spellEnd"/>
-            <w:r>
-              <w:rPr>
-                <w:rFonts w:ascii="Arial" w:hAnsi="Arial"/>
-                <w:color w:val="808080" w:themeColor="background1" w:themeShade="80"/>
-                <w:sz w:val="20"/>
-              </w:rPr>
-              <w:t xml:space="preserve"> </w:t>
-            </w:r>
-            <w:proofErr w:type="spellStart"/>
-            <w:r>
-              <w:rPr>
-                <w:rFonts w:ascii="Arial" w:hAnsi="Arial"/>
-                <w:color w:val="808080" w:themeColor="background1" w:themeShade="80"/>
-                <w:sz w:val="20"/>
-              </w:rPr>
-              <w:t>ůzných</w:t>
-            </w:r>
-            <w:proofErr w:type="spellEnd"/>
-            <w:r>
-              <w:rPr>
-                <w:rFonts w:ascii="Arial" w:hAnsi="Arial"/>
-                <w:color w:val="808080" w:themeColor="background1" w:themeShade="80"/>
-                <w:sz w:val="20"/>
-              </w:rPr>
-              <w:t xml:space="preserve"> </w:t>
-            </w:r>
-            <w:proofErr w:type="spellStart"/>
-            <w:r>
-              <w:rPr>
-                <w:rFonts w:ascii="Arial" w:hAnsi="Arial"/>
-                <w:color w:val="808080" w:themeColor="background1" w:themeShade="80"/>
-                <w:sz w:val="20"/>
-              </w:rPr>
-              <w:t>tréninků</w:t>
-            </w:r>
-            <w:proofErr w:type="spellEnd"/>
-          </w:p>
-          <w:p>
-            <w:pPr>
+            <w:r/>
+            <w:r>
+              <w:rPr>
+                <w:rFonts w:ascii="Arial" w:hAnsi="Arial"/>
+                <w:b w:val="0"/>
+                <w:color w:val="000000"/>
+                <w:sz w:val="18"/>
+              </w:rPr>
+              <w:t>• Obtížná organizace cviků v tréninku psa napříč disciplínami</w:t>
+            </w:r>
+          </w:p>
+          <w:p>
+            <w:pPr>
+              <w:spacing w:before="0" w:after="40" w:line="252" w:lineRule="auto"/>
+            </w:pPr>
+            <w:r>
+              <w:rPr>
+                <w:rFonts w:ascii="Arial" w:hAnsi="Arial"/>
+                <w:b w:val="0"/>
+                <w:color w:val="000000"/>
+                <w:sz w:val="18"/>
+              </w:rPr>
+              <w:t>• Těžké srovnávání efektivity různých tréninků</w:t>
+            </w:r>
+          </w:p>
+          <w:p>
+            <w:pPr>
+              <w:spacing w:before="0" w:after="40" w:line="252" w:lineRule="auto"/>
+            </w:pPr>
+            <w:r>
+              <w:rPr>
+                <w:rFonts w:ascii="Arial" w:hAnsi="Arial"/>
+                <w:b w:val="0"/>
+                <w:color w:val="000000"/>
+                <w:sz w:val="18"/>
+              </w:rPr>
+              <w:t>• Obtížná komunikace a ztráta kontextu mezi trenérem a majitelem psa mezi lekcemi</w:t>
+            </w:r>
+          </w:p>
+        </w:tc>
+        <w:tc>
+          <w:tcPr>
+            <w:tcW w:w="3198" w:type="dxa"/>
+            <w:gridSpan w:val="2"/>
+            <w:tcBorders>
+              <w:top w:val="nil"/>
+              <w:bottom w:val="nil"/>
+            </w:tcBorders>
+            <w:shd w:val="clear" w:color="auto" w:fill="FFFFFF" w:themeFill="background1"/>
+          </w:tcPr>
+          <w:p>
+            <w:pPr>
+              <w:spacing w:before="0" w:after="40" w:line="252" w:lineRule="auto"/>
               <w:rPr>
                 <w:rFonts w:ascii="Arial" w:hAnsi="Arial"/>
                 <w:color w:val="808080" w:themeColor="background1" w:themeShade="80"/>
@@ -828,21 +727,95 @@
                 <w:lang w:val="it-IT"/>
               </w:rPr>
             </w:pPr>
-            <w:r>
+            <w:r/>
+            <w:r>
+              <w:rPr>
+                <w:rFonts w:ascii="Arial" w:hAnsi="Arial"/>
+                <w:b w:val="0"/>
+                <w:color w:val="000000"/>
+                <w:sz w:val="19"/>
+              </w:rPr>
+              <w:t>Mobilní aplikace spojující trenéra a majitele psa, kde má trenér možnost připravovat cvičení a sledovat jejich efektivitu i plnění v reálném čase.</w:t>
+            </w:r>
+          </w:p>
+        </w:tc>
+        <w:tc>
+          <w:tcPr>
+            <w:tcW w:w="3227" w:type="dxa"/>
+            <w:gridSpan w:val="4"/>
+            <w:tcBorders>
+              <w:top w:val="nil"/>
+              <w:bottom w:val="nil"/>
+            </w:tcBorders>
+            <w:shd w:val="clear" w:color="auto" w:fill="FFFFFF" w:themeFill="background1"/>
+          </w:tcPr>
+          <w:p>
+            <w:pPr>
+              <w:spacing w:before="0" w:after="100" w:line="252" w:lineRule="auto"/>
+            </w:pPr>
+            <w:r/>
+            <w:r>
+              <w:rPr>
+                <w:rFonts w:ascii="Arial" w:hAnsi="Arial"/>
+                <w:b w:val="0"/>
+                <w:color w:val="000000"/>
+                <w:sz w:val="19"/>
+              </w:rPr>
+              <w:t>Vidíte, co vaši klienti mezi lekcemi opravdu odcvičili, a plán jim upravíte hned.</w:t>
+            </w:r>
+          </w:p>
+          <w:p>
+            <w:pPr>
+              <w:spacing w:before="0" w:after="40" w:line="252" w:lineRule="auto"/>
+            </w:pPr>
+            <w:r>
+              <w:rPr>
+                <w:rFonts w:ascii="Arial" w:hAnsi="Arial"/>
+                <w:b w:val="0"/>
+                <w:color w:val="000000"/>
+                <w:sz w:val="19"/>
+              </w:rPr>
+              <w:t>Plán od trenéra, týden v kalendáři a video se zpětnou vazbou u každého úkolu. Celý výcvik psa na jednom místě.</w:t>
+            </w:r>
+          </w:p>
+        </w:tc>
+        <w:tc>
+          <w:tcPr>
+            <w:tcW w:w="3032" w:type="dxa"/>
+            <w:gridSpan w:val="2"/>
+            <w:tcBorders>
+              <w:top w:val="nil"/>
+              <w:bottom w:val="nil"/>
+            </w:tcBorders>
+            <w:shd w:val="clear" w:color="auto" w:fill="FFFFFF" w:themeFill="background1"/>
+          </w:tcPr>
+          <w:p>
+            <w:pPr>
+              <w:spacing w:before="0" w:after="40" w:line="252" w:lineRule="auto"/>
+              <w:ind w:right="-10"/>
               <w:rPr>
                 <w:rFonts w:ascii="Arial" w:hAnsi="Arial"/>
                 <w:color w:val="808080" w:themeColor="background1" w:themeShade="80"/>
                 <w:sz w:val="20"/>
                 <w:lang w:val="it-IT"/>
               </w:rPr>
-              <w:t>Obtížná komunikace mezi trenérem a majitelem</w:t>
-            </w:r>
-          </w:p>
-        </w:tc>
-        <w:tc>
-          <w:tcPr>
-            <w:tcW w:w="3198" w:type="dxa"/>
-            <w:gridSpan w:val="2"/>
+            </w:pPr>
+            <w:r/>
+            <w:r>
+              <w:rPr>
+                <w:rFonts w:ascii="Arial" w:hAnsi="Arial"/>
+                <w:b w:val="0"/>
+                <w:color w:val="000000"/>
+                <w:sz w:val="19"/>
+              </w:rPr>
+              <w:t>Neexistuje</w:t>
+            </w:r>
+          </w:p>
+        </w:tc>
+        <w:tc>
+          <w:tcPr>
+            <w:tcW w:w="3050" w:type="dxa"/>
+            <w:gridSpan w:val="3"/>
             <w:tcBorders>
               <w:top w:val="nil"/>
               <w:bottom w:val="nil"/>
@@ -851,192 +824,50 @@
           </w:tcPr>
           <w:p>
             <w:pPr>
-              <w:rPr>
-                <w:rFonts w:ascii="Arial" w:hAnsi="Arial"/>
-                <w:color w:val="808080" w:themeColor="background1" w:themeShade="80"/>
-                <w:sz w:val="20"/>
-                <w:lang w:val="it-IT"/>
-              </w:rPr>
-            </w:pPr>
-            <w:r>
-              <w:rPr>
-                <w:rFonts w:ascii="Arial" w:hAnsi="Arial"/>
-                <w:color w:val="808080" w:themeColor="background1" w:themeShade="80"/>
-                <w:sz w:val="20"/>
-                <w:lang w:val="it-IT"/>
-              </w:rPr>
-              <w:t xml:space="preserve">Mobilní aplikace </w:t>
-            </w:r>
-            <w:r>
-              <w:rPr>
-                <w:rFonts w:ascii="Arial" w:hAnsi="Arial"/>
-                <w:color w:val="808080" w:themeColor="background1" w:themeShade="80"/>
-                <w:sz w:val="20"/>
-                <w:lang w:val="it-IT"/>
-              </w:rPr>
-              <w:t xml:space="preserve">spojující </w:t>
-            </w:r>
-            <w:r>
-              <w:rPr>
-                <w:rFonts w:ascii="Arial" w:hAnsi="Arial"/>
-                <w:color w:val="808080" w:themeColor="background1" w:themeShade="80"/>
-                <w:sz w:val="20"/>
-                <w:lang w:val="it-IT"/>
-              </w:rPr>
-              <w:t xml:space="preserve">ternéra a majitele psa, kde má trenér možnost </w:t>
-            </w:r>
-            <w:r>
-              <w:rPr>
-                <w:rFonts w:ascii="Arial" w:hAnsi="Arial"/>
-                <w:color w:val="808080" w:themeColor="background1" w:themeShade="80"/>
-                <w:sz w:val="20"/>
-                <w:lang w:val="it-IT"/>
-              </w:rPr>
-              <w:t xml:space="preserve">připravovat </w:t>
-            </w:r>
-            <w:r>
-              <w:rPr>
-                <w:rFonts w:ascii="Arial" w:hAnsi="Arial"/>
-                <w:color w:val="808080" w:themeColor="background1" w:themeShade="80"/>
-                <w:sz w:val="20"/>
-                <w:lang w:val="it-IT"/>
-              </w:rPr>
-              <w:t>různ</w:t>
-            </w:r>
-            <w:r>
-              <w:rPr>
-                <w:rFonts w:ascii="Arial" w:hAnsi="Arial"/>
-                <w:color w:val="808080" w:themeColor="background1" w:themeShade="80"/>
-                <w:sz w:val="20"/>
-                <w:lang w:val="it-IT"/>
-              </w:rPr>
-              <w:t xml:space="preserve">á </w:t>
-            </w:r>
-            <w:r>
-              <w:rPr>
-                <w:rFonts w:ascii="Arial" w:hAnsi="Arial"/>
-                <w:color w:val="808080" w:themeColor="background1" w:themeShade="80"/>
-                <w:sz w:val="20"/>
-                <w:lang w:val="it-IT"/>
-              </w:rPr>
-              <w:t xml:space="preserve">cvičení a </w:t>
-            </w:r>
-            <w:r>
-              <w:rPr>
-                <w:rFonts w:ascii="Arial" w:hAnsi="Arial"/>
-                <w:color w:val="808080" w:themeColor="background1" w:themeShade="80"/>
-                <w:sz w:val="20"/>
-                <w:lang w:val="it-IT"/>
-              </w:rPr>
-              <w:t>sledovat jejich efektivitu.</w:t>
-            </w:r>
-          </w:p>
-        </w:tc>
-        <w:tc>
-          <w:tcPr>
-            <w:tcW w:w="3227" w:type="dxa"/>
-            <w:gridSpan w:val="4"/>
-            <w:tcBorders>
-              <w:top w:val="nil"/>
-              <w:bottom w:val="nil"/>
-            </w:tcBorders>
-            <w:shd w:val="clear" w:color="auto" w:fill="FFFFFF" w:themeFill="background1"/>
-          </w:tcPr>
-          <w:p>
-            <w:r>
-              <w:rPr>
-                <w:rFonts w:ascii="Arial" w:hAnsi="Arial"/>
-                <w:color w:val="808080" w:themeColor="background1" w:themeShade="80"/>
-                <w:sz w:val="20"/>
-                <w:szCs w:val="20"/>
-                <w:lang w:val="it-IT"/>
-              </w:rPr>
-              <w:t>Vidíte, co vaši klienti mezi lekcemi opravdu odcvičili, a plán jim upravíte hned.</w:t>
-            </w:r>
-            <w:r>
-              <w:br/>
-            </w:r>
-            <w:r>
-              <w:rPr>
-                <w:rFonts w:ascii="Arial" w:hAnsi="Arial"/>
-                <w:color w:val="808080" w:themeColor="background1" w:themeShade="80"/>
-                <w:sz w:val="20"/>
-                <w:szCs w:val="20"/>
-                <w:lang w:val="it-IT"/>
-              </w:rPr>
-              <w:t>Plán od trenéra, týden v kalendáři a video se zpětnou vazbou u každého úkolu. Celý výcvik psa na jednom místě.</w:t>
-            </w:r>
-          </w:p>
-        </w:tc>
-        <w:tc>
-          <w:tcPr>
-            <w:tcW w:w="3032" w:type="dxa"/>
-            <w:gridSpan w:val="2"/>
-            <w:tcBorders>
-              <w:top w:val="nil"/>
-              <w:bottom w:val="nil"/>
-            </w:tcBorders>
-            <w:shd w:val="clear" w:color="auto" w:fill="FFFFFF" w:themeFill="background1"/>
-          </w:tcPr>
-          <w:p>
-            <w:pPr>
-              <w:ind w:right="-10"/>
-              <w:rPr>
-                <w:rFonts w:ascii="Arial" w:hAnsi="Arial"/>
-                <w:color w:val="808080" w:themeColor="background1" w:themeShade="80"/>
-                <w:sz w:val="20"/>
-                <w:lang w:val="it-IT"/>
-              </w:rPr>
-            </w:pPr>
-            <w:r>
-              <w:rPr>
-                <w:rFonts w:ascii="Arial" w:hAnsi="Arial"/>
-                <w:color w:val="808080" w:themeColor="background1" w:themeShade="80"/>
-                <w:sz w:val="20"/>
-                <w:lang w:val="it-IT"/>
-              </w:rPr>
-              <w:t>Neexistuje</w:t>
-            </w:r>
-          </w:p>
-        </w:tc>
-        <w:tc>
-          <w:tcPr>
-            <w:tcW w:w="3050" w:type="dxa"/>
-            <w:gridSpan w:val="3"/>
-            <w:tcBorders>
-              <w:top w:val="nil"/>
-              <w:bottom w:val="nil"/>
-            </w:tcBorders>
-            <w:shd w:val="clear" w:color="auto" w:fill="FFFFFF" w:themeFill="background1"/>
-          </w:tcPr>
-          <w:p>
-            <w:pPr>
+              <w:spacing w:before="0" w:after="100" w:line="252" w:lineRule="auto"/>
               <w:ind w:right="-18"/>
             </w:pPr>
-            <w:r>
-              <w:rPr>
-                <w:rFonts w:ascii="Arial" w:hAnsi="Arial"/>
-                <w:color w:val="808080" w:themeColor="background1" w:themeShade="80"/>
-                <w:sz w:val="20"/>
-                <w:szCs w:val="20"/>
-                <w:lang w:val="it-IT"/>
-              </w:rPr>
-              <w:t>Zákazník (platí): nezávislí trenéři a trenérky, kteří vedou klienty i mezi lekcemi.</w:t>
-            </w:r>
-          </w:p>
-          <w:p>
-            <w:pPr>
-              <w:ind w:right="-18"/>
-            </w:pPr>
-            <w:r>
-              <w:rPr>
-                <w:rFonts w:ascii="Arial" w:hAnsi="Arial"/>
-                <w:color w:val="808080" w:themeColor="background1" w:themeShade="80"/>
-                <w:sz w:val="20"/>
-                <w:szCs w:val="20"/>
-                <w:lang w:val="it-IT"/>
-              </w:rPr>
-              <w:t>Uživatel (zdarma): psovodi, kteří trénují ve 2 a více disciplínách současně.</w:t>
+            <w:r/>
+            <w:r>
+              <w:rPr>
+                <w:rFonts w:ascii="Arial" w:hAnsi="Arial"/>
+                <w:b/>
+                <w:color w:val="000000"/>
+                <w:sz w:val="19"/>
+              </w:rPr>
+              <w:t>Zákazník (platí):</w:t>
+            </w:r>
+            <w:r>
+              <w:rPr>
+                <w:rFonts w:ascii="Arial" w:hAnsi="Arial"/>
+                <w:b w:val="0"/>
+                <w:color w:val="000000"/>
+                <w:sz w:val="19"/>
+              </w:rPr>
+              <w:t xml:space="preserve"> Nezávislí trenéři a trenérky, kteří vedou klienty i mezi lekcemi.</w:t>
+            </w:r>
+          </w:p>
+          <w:p>
+            <w:pPr>
+              <w:spacing w:before="0" w:after="40" w:line="252" w:lineRule="auto"/>
+            </w:pPr>
+            <w:r>
+              <w:rPr>
+                <w:rFonts w:ascii="Arial" w:hAnsi="Arial"/>
+                <w:b/>
+                <w:color w:val="000000"/>
+                <w:sz w:val="19"/>
+              </w:rPr>
+              <w:t>Uživatel (zdarma):</w:t>
+            </w:r>
+            <w:r>
+              <w:rPr>
+                <w:rFonts w:ascii="Arial" w:hAnsi="Arial"/>
+                <w:b w:val="0"/>
+                <w:color w:val="000000"/>
+                <w:sz w:val="19"/>
+              </w:rPr>
+              <w:t xml:space="preserve"> Psovodi, kteří trénují ve 2 a více disciplínách současně.</w:t>
             </w:r>
           </w:p>
         </w:tc>
@@ -1209,102 +1040,184 @@
           </w:tcPr>
           <w:p>
             <w:pPr>
+              <w:spacing w:before="0" w:after="40" w:line="252" w:lineRule="auto"/>
               <w:rPr>
                 <w:rFonts w:ascii="Arial" w:hAnsi="Arial"/>
                 <w:color w:val="808080" w:themeColor="background1" w:themeShade="80"/>
                 <w:sz w:val="20"/>
               </w:rPr>
             </w:pPr>
-            <w:proofErr w:type="spellStart"/>
-            <w:r>
+            <w:r/>
+            <w:r>
+              <w:rPr>
+                <w:rFonts w:ascii="Arial" w:hAnsi="Arial"/>
+                <w:b w:val="0"/>
+                <w:color w:val="000000"/>
+                <w:sz w:val="19"/>
+              </w:rPr>
+              <w:t>• Tužka a papír</w:t>
+            </w:r>
+          </w:p>
+          <w:p>
+            <w:pPr>
+              <w:spacing w:before="0" w:after="40" w:line="252" w:lineRule="auto"/>
+            </w:pPr>
+            <w:r>
+              <w:rPr>
+                <w:rFonts w:ascii="Arial" w:hAnsi="Arial"/>
+                <w:b w:val="0"/>
+                <w:color w:val="000000"/>
+                <w:sz w:val="19"/>
+              </w:rPr>
+              <w:t>• Excel</w:t>
+            </w:r>
+          </w:p>
+          <w:p>
+            <w:pPr>
+              <w:spacing w:before="0" w:after="40" w:line="252" w:lineRule="auto"/>
+            </w:pPr>
+            <w:r>
+              <w:rPr>
+                <w:rFonts w:ascii="Arial" w:hAnsi="Arial"/>
+                <w:b w:val="0"/>
+                <w:color w:val="000000"/>
+                <w:sz w:val="19"/>
+              </w:rPr>
+              <w:t>• Strava</w:t>
+            </w:r>
+          </w:p>
+          <w:p>
+            <w:pPr>
+              <w:spacing w:before="0" w:after="40" w:line="252" w:lineRule="auto"/>
+            </w:pPr>
+            <w:r>
+              <w:rPr>
+                <w:rFonts w:ascii="Arial" w:hAnsi="Arial"/>
+                <w:b w:val="0"/>
+                <w:color w:val="000000"/>
+                <w:sz w:val="19"/>
+              </w:rPr>
+              <w:t>• Habit trackery</w:t>
+            </w:r>
+          </w:p>
+        </w:tc>
+        <w:tc>
+          <w:tcPr>
+            <w:tcW w:w="3198" w:type="dxa"/>
+            <w:gridSpan w:val="2"/>
+            <w:tcBorders>
+              <w:top w:val="nil"/>
+              <w:bottom w:val="single" w:sz="4" w:space="0" w:color="F2F2F2" w:themeColor="background1" w:themeShade="F2"/>
+            </w:tcBorders>
+            <w:shd w:val="clear" w:color="auto" w:fill="FFFFFF" w:themeFill="background1"/>
+          </w:tcPr>
+          <w:p>
+            <w:pPr>
+              <w:spacing w:before="0" w:after="40" w:line="252" w:lineRule="auto"/>
               <w:rPr>
                 <w:rFonts w:ascii="Arial" w:hAnsi="Arial"/>
                 <w:color w:val="808080" w:themeColor="background1" w:themeShade="80"/>
                 <w:sz w:val="20"/>
               </w:rPr>
-              <w:t>Tužka</w:t>
-            </w:r>
-            <w:proofErr w:type="spellEnd"/>
-            <w:r>
-              <w:rPr>
-                <w:rFonts w:ascii="Arial" w:hAnsi="Arial"/>
-                <w:color w:val="808080" w:themeColor="background1" w:themeShade="80"/>
-                <w:sz w:val="20"/>
-              </w:rPr>
-              <w:t xml:space="preserve"> a </w:t>
-            </w:r>
-            <w:proofErr w:type="spellStart"/>
-            <w:r>
-              <w:rPr>
-                <w:rFonts w:ascii="Arial" w:hAnsi="Arial"/>
-                <w:color w:val="808080" w:themeColor="background1" w:themeShade="80"/>
-                <w:sz w:val="20"/>
-              </w:rPr>
-              <w:t>papír</w:t>
-            </w:r>
-            <w:proofErr w:type="spellEnd"/>
-          </w:p>
-          <w:p>
-            <w:pPr>
-              <w:rPr>
-                <w:rFonts w:ascii="Arial" w:hAnsi="Arial"/>
-                <w:color w:val="808080" w:themeColor="background1" w:themeShade="80"/>
-                <w:sz w:val="20"/>
-              </w:rPr>
-            </w:pPr>
-            <w:r>
-              <w:rPr>
-                <w:rFonts w:ascii="Arial" w:hAnsi="Arial"/>
-                <w:color w:val="808080" w:themeColor="background1" w:themeShade="80"/>
-                <w:sz w:val="20"/>
-              </w:rPr>
-              <w:t>Excel</w:t>
-            </w:r>
-          </w:p>
-          <w:p>
-            <w:pPr>
-              <w:rPr>
-                <w:rFonts w:ascii="Arial" w:hAnsi="Arial"/>
-                <w:color w:val="808080" w:themeColor="background1" w:themeShade="80"/>
-                <w:sz w:val="20"/>
-              </w:rPr>
-            </w:pPr>
-            <w:r>
-              <w:rPr>
-                <w:rFonts w:ascii="Arial" w:hAnsi="Arial"/>
-                <w:color w:val="808080" w:themeColor="background1" w:themeShade="80"/>
-                <w:sz w:val="20"/>
-              </w:rPr>
-              <w:t>Strava</w:t>
-            </w:r>
-          </w:p>
-          <w:p>
-            <w:r>
-              <w:rPr>
-                <w:rFonts w:ascii="Arial" w:hAnsi="Arial"/>
-                <w:color w:val="808080" w:themeColor="background1" w:themeShade="80"/>
-                <w:sz w:val="20"/>
-                <w:szCs w:val="20"/>
-              </w:rPr>
-              <w:t>Habit trackery</w:t>
-            </w:r>
-          </w:p>
-          <w:p>
-            <w:r>
-              <w:rPr>
-                <w:rFonts w:ascii="Arial" w:hAnsi="Arial"/>
-                <w:color w:val="808080" w:themeColor="background1" w:themeShade="80"/>
-                <w:sz w:val="20"/>
-                <w:szCs w:val="20"/>
-              </w:rPr>
-              <w:t>WhatApp</w:t>
-            </w:r>
-          </w:p>
-        </w:tc>
-        <w:tc>
-          <w:tcPr>
-            <w:tcW w:w="3198" w:type="dxa"/>
-            <w:gridSpan w:val="2"/>
+            </w:pPr>
+            <w:r/>
+            <w:r>
+              <w:rPr>
+                <w:rFonts w:ascii="Arial" w:hAnsi="Arial"/>
+                <w:b w:val="0"/>
+                <w:color w:val="000000"/>
+                <w:sz w:val="18"/>
+              </w:rPr>
+              <w:t xml:space="preserve">• </w:t>
+            </w:r>
+            <w:r>
+              <w:rPr>
+                <w:rFonts w:ascii="Arial" w:hAnsi="Arial"/>
+                <w:b/>
+                <w:color w:val="000000"/>
+                <w:sz w:val="18"/>
+              </w:rPr>
+              <w:t>10 platících trenérů</w:t>
+            </w:r>
+            <w:r>
+              <w:rPr>
+                <w:rFonts w:ascii="Arial" w:hAnsi="Arial"/>
+                <w:b w:val="0"/>
+                <w:color w:val="000000"/>
+                <w:sz w:val="18"/>
+              </w:rPr>
+              <w:t xml:space="preserve"> do 6 měsíců od spuštění pilotu</w:t>
+            </w:r>
+          </w:p>
+          <w:p>
+            <w:pPr>
+              <w:spacing w:before="0" w:after="40" w:line="252" w:lineRule="auto"/>
+            </w:pPr>
+            <w:r>
+              <w:rPr>
+                <w:rFonts w:ascii="Arial" w:hAnsi="Arial"/>
+                <w:b w:val="0"/>
+                <w:color w:val="000000"/>
+                <w:sz w:val="18"/>
+              </w:rPr>
+              <w:t xml:space="preserve">• </w:t>
+            </w:r>
+            <w:r>
+              <w:rPr>
+                <w:rFonts w:ascii="Arial" w:hAnsi="Arial"/>
+                <w:b/>
+                <w:color w:val="000000"/>
+                <w:sz w:val="18"/>
+              </w:rPr>
+              <w:t>Minimálně 50 psů</w:t>
+            </w:r>
+            <w:r>
+              <w:rPr>
+                <w:rFonts w:ascii="Arial" w:hAnsi="Arial"/>
+                <w:b w:val="0"/>
+                <w:color w:val="000000"/>
+                <w:sz w:val="18"/>
+              </w:rPr>
+              <w:t xml:space="preserve"> aktivně vedených v aplikaci</w:t>
+            </w:r>
+          </w:p>
+          <w:p>
+            <w:pPr>
+              <w:spacing w:before="0" w:after="40" w:line="252" w:lineRule="auto"/>
+            </w:pPr>
+            <w:r>
+              <w:rPr>
+                <w:rFonts w:ascii="Arial" w:hAnsi="Arial"/>
+                <w:b w:val="0"/>
+                <w:color w:val="000000"/>
+                <w:sz w:val="18"/>
+              </w:rPr>
+              <w:t xml:space="preserve">• </w:t>
+            </w:r>
+            <w:r>
+              <w:rPr>
+                <w:rFonts w:ascii="Arial" w:hAnsi="Arial"/>
+                <w:b/>
+                <w:color w:val="000000"/>
+                <w:sz w:val="18"/>
+              </w:rPr>
+              <w:t>Retence psovodů:</w:t>
+            </w:r>
+            <w:r>
+              <w:rPr>
+                <w:rFonts w:ascii="Arial" w:hAnsi="Arial"/>
+                <w:b w:val="0"/>
+                <w:color w:val="000000"/>
+                <w:sz w:val="18"/>
+              </w:rPr>
+              <w:t xml:space="preserve"> ≥ 60 % psovodů zapíše ≥ 2 tréninky týdně</w:t>
+            </w:r>
+          </w:p>
+        </w:tc>
+        <w:tc>
+          <w:tcPr>
+            <w:tcW w:w="3227" w:type="dxa"/>
+            <w:gridSpan w:val="4"/>
             <w:tcBorders>
               <w:top w:val="nil"/>
               <w:bottom w:val="single" w:sz="4" w:space="0" w:color="F2F2F2" w:themeColor="background1" w:themeShade="F2"/>
@@ -1313,165 +1226,24 @@
           </w:tcPr>
           <w:p>
             <w:pPr>
-              <w:rPr>
-                <w:rFonts w:ascii="Arial" w:hAnsi="Arial"/>
-                <w:color w:val="808080" w:themeColor="background1" w:themeShade="80"/>
-                <w:sz w:val="20"/>
-              </w:rPr>
-            </w:pPr>
-            <w:proofErr w:type="spellStart"/>
-            <w:r>
-              <w:rPr>
-                <w:rFonts w:ascii="Arial" w:hAnsi="Arial"/>
-                <w:color w:val="808080" w:themeColor="background1" w:themeShade="80"/>
-                <w:sz w:val="20"/>
-              </w:rPr>
-              <w:t>Počet</w:t>
-            </w:r>
-            <w:proofErr w:type="spellEnd"/>
-            <w:r>
-              <w:rPr>
-                <w:rFonts w:ascii="Arial" w:hAnsi="Arial"/>
-                <w:color w:val="808080" w:themeColor="background1" w:themeShade="80"/>
-                <w:sz w:val="20"/>
-              </w:rPr>
-              <w:t xml:space="preserve"> </w:t>
-            </w:r>
-            <w:proofErr w:type="spellStart"/>
-            <w:r>
-              <w:rPr>
-                <w:rFonts w:ascii="Arial" w:hAnsi="Arial"/>
-                <w:color w:val="808080" w:themeColor="background1" w:themeShade="80"/>
-                <w:sz w:val="20"/>
-              </w:rPr>
-              <w:t>platících</w:t>
-            </w:r>
-            <w:proofErr w:type="spellEnd"/>
-            <w:r>
-              <w:rPr>
-                <w:rFonts w:ascii="Arial" w:hAnsi="Arial"/>
-                <w:color w:val="808080" w:themeColor="background1" w:themeShade="80"/>
-                <w:sz w:val="20"/>
-              </w:rPr>
-              <w:t xml:space="preserve"> </w:t>
-            </w:r>
-            <w:proofErr w:type="spellStart"/>
-            <w:r>
-              <w:rPr>
-                <w:rFonts w:ascii="Arial" w:hAnsi="Arial"/>
-                <w:color w:val="808080" w:themeColor="background1" w:themeShade="80"/>
-                <w:sz w:val="20"/>
-              </w:rPr>
-              <w:t>trenérů</w:t>
-            </w:r>
-            <w:proofErr w:type="spellEnd"/>
-          </w:p>
-          <w:p>
-            <w:pPr>
-              <w:rPr>
-                <w:rFonts w:ascii="Arial" w:hAnsi="Arial"/>
-                <w:color w:val="808080" w:themeColor="background1" w:themeShade="80"/>
-                <w:sz w:val="20"/>
-                <w:szCs w:val="20"/>
-              </w:rPr>
-            </w:pPr>
-            <w:r>
-              <w:rPr>
-                <w:rFonts w:ascii="Arial" w:hAnsi="Arial"/>
-                <w:color w:val="808080" w:themeColor="background1" w:themeShade="80"/>
-                <w:sz w:val="20"/>
-                <w:szCs w:val="20"/>
-              </w:rPr>
-              <w:t>10 na konci 2027</w:t>
-            </w:r>
-          </w:p>
-          <w:p>
-            <w:pPr>
-              <w:rPr>
-                <w:rFonts w:ascii="Arial" w:hAnsi="Arial"/>
-                <w:color w:val="808080" w:themeColor="background1" w:themeShade="80"/>
-                <w:sz w:val="20"/>
-              </w:rPr>
-            </w:pPr>
-            <w:proofErr w:type="spellStart"/>
-            <w:r>
-              <w:rPr>
-                <w:rFonts w:ascii="Arial" w:hAnsi="Arial"/>
-                <w:color w:val="808080" w:themeColor="background1" w:themeShade="80"/>
-                <w:sz w:val="20"/>
-                <w:szCs w:val="20"/>
-              </w:rPr>
-              <w:t>Počet</w:t>
-            </w:r>
-            <w:proofErr w:type="spellEnd"/>
-            <w:r>
-              <w:rPr>
-                <w:rFonts w:ascii="Arial" w:hAnsi="Arial"/>
-                <w:color w:val="808080" w:themeColor="background1" w:themeShade="80"/>
-                <w:sz w:val="20"/>
-                <w:szCs w:val="20"/>
-              </w:rPr>
-              <w:t xml:space="preserve"> </w:t>
-            </w:r>
-            <w:proofErr w:type="spellStart"/>
-            <w:r>
-              <w:rPr>
-                <w:rFonts w:ascii="Arial" w:hAnsi="Arial"/>
-                <w:color w:val="808080" w:themeColor="background1" w:themeShade="80"/>
-                <w:sz w:val="20"/>
-                <w:szCs w:val="20"/>
-              </w:rPr>
-              <w:t>psů</w:t>
-            </w:r>
-            <w:proofErr w:type="spellEnd"/>
-          </w:p>
-          <w:p>
-            <w:pPr>
-              <w:spacing w:line="259" w:lineRule="auto"/>
-              <w:rPr>
-                <w:rFonts w:ascii="Arial" w:hAnsi="Arial"/>
-                <w:color w:val="808080" w:themeColor="background1" w:themeShade="80"/>
-                <w:sz w:val="20"/>
-                <w:szCs w:val="20"/>
-              </w:rPr>
-            </w:pPr>
-            <w:r>
-              <w:rPr>
-                <w:rFonts w:ascii="Arial" w:hAnsi="Arial"/>
-                <w:color w:val="808080" w:themeColor="background1" w:themeShade="80"/>
-                <w:sz w:val="20"/>
-                <w:szCs w:val="20"/>
-              </w:rPr>
-              <w:t>50 na konci 2027</w:t>
-            </w:r>
-          </w:p>
-          <w:p>
-            <w:r>
-              <w:rPr>
-                <w:rFonts w:ascii="Arial" w:hAnsi="Arial"/>
-                <w:color w:val="808080" w:themeColor="background1" w:themeShade="80"/>
-                <w:sz w:val="20"/>
-                <w:szCs w:val="20"/>
-              </w:rPr>
-              <w:t>Podíl úkolů s reakcí od trenéra</w:t>
-            </w:r>
-          </w:p>
-          <w:p>
-            <w:r>
-              <w:rPr>
-                <w:rFonts w:ascii="Arial" w:hAnsi="Arial"/>
-                <w:color w:val="808080" w:themeColor="background1" w:themeShade="80"/>
-                <w:sz w:val="20"/>
-                <w:szCs w:val="20"/>
-              </w:rPr>
-              <w:t>&gt;60%</w:t>
-            </w:r>
-          </w:p>
-        </w:tc>
-        <w:tc>
-          <w:tcPr>
-            <w:tcW w:w="3227" w:type="dxa"/>
-            <w:gridSpan w:val="4"/>
+              <w:spacing w:before="0" w:after="40" w:line="252" w:lineRule="auto"/>
+            </w:pPr>
+            <w:r/>
+            <w:r>
+              <w:rPr>
+                <w:rFonts w:ascii="Arial" w:hAnsi="Arial"/>
+                <w:b w:val="0"/>
+                <w:color w:val="000000"/>
+                <w:sz w:val="19"/>
+              </w:rPr>
+              <w:t>TrueCoach / TrainingPeaks pro trenéry psů</w:t>
+            </w:r>
+          </w:p>
+        </w:tc>
+        <w:tc>
+          <w:tcPr>
+            <w:tcW w:w="3032" w:type="dxa"/>
+            <w:gridSpan w:val="2"/>
             <w:tcBorders>
               <w:top w:val="nil"/>
               <w:bottom w:val="single" w:sz="4" w:space="0" w:color="F2F2F2" w:themeColor="background1" w:themeShade="F2"/>
@@ -1479,22 +1251,40 @@
             <w:shd w:val="clear" w:color="auto" w:fill="FFFFFF" w:themeFill="background1"/>
           </w:tcPr>
           <w:p>
-            <w:r>
-              <w:rPr>
-                <w:rFonts w:ascii="Arial" w:hAnsi="Arial"/>
-                <w:color w:val="808080" w:themeColor="background1" w:themeShade="80"/>
-                <w:sz w:val="20"/>
-                <w:szCs w:val="20"/>
-                <w:lang w:val="it-IT"/>
-              </w:rPr>
-              <w:t>TrueCoach / TrainingPeaks pro trenéry psů</w:t>
-            </w:r>
-          </w:p>
-        </w:tc>
-        <w:tc>
-          <w:tcPr>
-            <w:tcW w:w="3032" w:type="dxa"/>
-            <w:gridSpan w:val="2"/>
+            <w:pPr>
+              <w:spacing w:before="0" w:after="40" w:line="252" w:lineRule="auto"/>
+              <w:ind w:right="-10"/>
+            </w:pPr>
+            <w:r/>
+            <w:r>
+              <w:rPr>
+                <w:rFonts w:ascii="Arial" w:hAnsi="Arial"/>
+                <w:b w:val="0"/>
+                <w:color w:val="000000"/>
+                <w:sz w:val="19"/>
+              </w:rPr>
+              <w:t>• Osobní oslovení trenérů a psích škol (přes kontakty PO a psí akce)</w:t>
+            </w:r>
+          </w:p>
+          <w:p>
+            <w:pPr>
+              <w:spacing w:before="0" w:after="40" w:line="252" w:lineRule="auto"/>
+            </w:pPr>
+            <w:r>
+              <w:rPr>
+                <w:rFonts w:ascii="Arial" w:hAnsi="Arial"/>
+                <w:b w:val="0"/>
+                <w:color w:val="000000"/>
+                <w:sz w:val="19"/>
+              </w:rPr>
+              <w:t>• Přirozená virální smyčka: trenér onboarduje své klienty</w:t>
+            </w:r>
+          </w:p>
+        </w:tc>
+        <w:tc>
+          <w:tcPr>
+            <w:tcW w:w="3050" w:type="dxa"/>
+            <w:gridSpan w:val="3"/>
             <w:tcBorders>
               <w:top w:val="nil"/>
               <w:bottom w:val="single" w:sz="4" w:space="0" w:color="F2F2F2" w:themeColor="background1" w:themeShade="F2"/>
@@ -1503,41 +1293,32 @@
           </w:tcPr>
           <w:p>
             <w:pPr>
+              <w:spacing w:before="0" w:after="80" w:line="252" w:lineRule="auto"/>
               <w:ind w:right="-10"/>
             </w:pPr>
-            <w:r>
-              <w:rPr>
-                <w:rFonts w:ascii="Arial" w:hAnsi="Arial"/>
-                <w:color w:val="808080" w:themeColor="background1" w:themeShade="80"/>
-                <w:sz w:val="20"/>
-                <w:szCs w:val="20"/>
-              </w:rPr>
-              <w:t>Osobní oslovení trenérů a psích škol (přes kontakty PO a psí akce)</w:t>
-            </w:r>
-          </w:p>
-        </w:tc>
-        <w:tc>
-          <w:tcPr>
-            <w:tcW w:w="3050" w:type="dxa"/>
-            <w:gridSpan w:val="3"/>
-            <w:tcBorders>
-              <w:top w:val="nil"/>
-              <w:bottom w:val="single" w:sz="4" w:space="0" w:color="F2F2F2" w:themeColor="background1" w:themeShade="F2"/>
-            </w:tcBorders>
-            <w:shd w:val="clear" w:color="auto" w:fill="FFFFFF" w:themeFill="background1"/>
-          </w:tcPr>
-          <w:p>
-            <w:pPr>
-              <w:ind w:right="-10"/>
-            </w:pPr>
-            <w:r>
-              <w:rPr>
-                <w:rFonts w:ascii="Arial" w:hAnsi="Arial"/>
-                <w:color w:val="808080" w:themeColor="background1" w:themeShade="80"/>
-                <w:sz w:val="20"/>
-                <w:szCs w:val="20"/>
-              </w:rPr>
-              <w:t>Lidé, se kterými už trénuje Veronika (PO): její trenéři a trenérky a jejich klienti. Obecně nezávislí trenéři a trenérky s 5–20 klienty, kteří dnes dávají zpětnou vazbu např. přes WhatsApp.</w:t>
+            <w:r/>
+            <w:r>
+              <w:rPr>
+                <w:rFonts w:ascii="Arial" w:hAnsi="Arial"/>
+                <w:b w:val="0"/>
+                <w:color w:val="000000"/>
+                <w:sz w:val="18"/>
+              </w:rPr>
+              <w:t>• Lidé, se kterými už trénuje Veronika (PO): její trenéři a trenérky a jejich klienti.</w:t>
+            </w:r>
+          </w:p>
+          <w:p>
+            <w:pPr>
+              <w:spacing w:before="0" w:after="40" w:line="252" w:lineRule="auto"/>
+            </w:pPr>
+            <w:r>
+              <w:rPr>
+                <w:rFonts w:ascii="Arial" w:hAnsi="Arial"/>
+                <w:b w:val="0"/>
+                <w:color w:val="000000"/>
+                <w:sz w:val="18"/>
+              </w:rPr>
+              <w:t>• Obecně nezávislí trenéři a trenérky s 5–20 klienty, kteří dnes dávají zpětnou vazbu např. přes WhatsApp.</w:t>
             </w:r>
           </w:p>
         </w:tc>
@@ -1618,16 +1399,46 @@
           </w:tcPr>
           <w:p>
             <w:pPr>
+              <w:spacing w:before="0" w:after="40" w:line="252" w:lineRule="auto"/>
               <w:ind w:right="-32"/>
             </w:pPr>
-            <w:r>
-              <w:rPr>
-                <w:rFonts w:ascii="Arial" w:hAnsi="Arial"/>
-                <w:color w:val="808080" w:themeColor="background1" w:themeShade="80"/>
-                <w:sz w:val="20"/>
-                <w:szCs w:val="20"/>
-              </w:rPr>
-              <w:t>Běžná cloudová infrastruktura (databáze, hosting), náklady na vývoj</w:t>
+            <w:r/>
+            <w:r>
+              <w:rPr>
+                <w:rFonts w:ascii="Arial" w:hAnsi="Arial"/>
+                <w:b w:val="0"/>
+                <w:color w:val="000000"/>
+                <w:sz w:val="19"/>
+              </w:rPr>
+              <w:t>• Běžná cloudová infrastruktura (databáze, hosting)</w:t>
+            </w:r>
+          </w:p>
+          <w:p>
+            <w:pPr>
+              <w:spacing w:before="0" w:after="40" w:line="252" w:lineRule="auto"/>
+            </w:pPr>
+            <w:r>
+              <w:rPr>
+                <w:rFonts w:ascii="Arial" w:hAnsi="Arial"/>
+                <w:b w:val="0"/>
+                <w:color w:val="000000"/>
+                <w:sz w:val="19"/>
+              </w:rPr>
+              <w:t>• Vývoj a údržba aplikace</w:t>
+            </w:r>
+          </w:p>
+          <w:p>
+            <w:pPr>
+              <w:spacing w:before="0" w:after="40" w:line="252" w:lineRule="auto"/>
+            </w:pPr>
+            <w:r>
+              <w:rPr>
+                <w:rFonts w:ascii="Arial" w:hAnsi="Arial"/>
+                <w:b w:val="0"/>
+                <w:color w:val="000000"/>
+                <w:sz w:val="19"/>
+              </w:rPr>
+              <w:t>• Náklady na vývojářské účty (Apple Developer, Google Play)</w:t>
             </w:r>
           </w:p>
         </w:tc>
@@ -1642,17 +1453,46 @@
           </w:tcPr>
           <w:p>
             <w:pPr>
+              <w:spacing w:before="0" w:after="40" w:line="252" w:lineRule="auto"/>
               <w:ind w:right="-18"/>
             </w:pPr>
-            <w:r>
-              <w:rPr>
-                <w:rFonts w:ascii="Arial" w:hAnsi="Arial"/>
-                <w:color w:val="808080" w:themeColor="background1" w:themeShade="80"/>
-                <w:sz w:val="20"/>
-                <w:szCs w:val="20"/>
-                <w:lang w:val="cs-CZ"/>
-              </w:rPr>
-              <w:t>Měsíční SaaS předplatné pro trenéry (např. 490 Kč / měsíc), psovodi zdarma.</w:t>
+            <w:r/>
+            <w:r>
+              <w:rPr>
+                <w:rFonts w:ascii="Arial" w:hAnsi="Arial"/>
+                <w:b/>
+                <w:color w:val="000000"/>
+                <w:sz w:val="19"/>
+              </w:rPr>
+              <w:t>B2B SaaS předplatné pro trenéry:</w:t>
+            </w:r>
+          </w:p>
+          <w:p>
+            <w:pPr>
+              <w:spacing w:before="0" w:after="40" w:line="252" w:lineRule="auto"/>
+            </w:pPr>
+            <w:r>
+              <w:rPr>
+                <w:rFonts w:ascii="Arial" w:hAnsi="Arial"/>
+                <w:b w:val="0"/>
+                <w:color w:val="000000"/>
+                <w:sz w:val="19"/>
+              </w:rPr>
+              <w:t>• Např. 490 Kč / měsíc (do 15 aktivních psů)</w:t>
+            </w:r>
+          </w:p>
+          <w:p>
+            <w:pPr>
+              <w:spacing w:before="0" w:after="40" w:line="252" w:lineRule="auto"/>
+            </w:pPr>
+            <w:r>
+              <w:rPr>
+                <w:rFonts w:ascii="Arial" w:hAnsi="Arial"/>
+                <w:b w:val="0"/>
+                <w:color w:val="000000"/>
+                <w:sz w:val="19"/>
+              </w:rPr>
+              <w:t>• Pro psovody: 0 Kč (v rámci výcviku pod trenérem)</w:t>
             </w:r>
           </w:p>
         </w:tc>

</xml_diff>